<commit_message>
vpscreen-rerank 2026-09-09 midday: mechanical refresh cycle
No new research since the 08:20Z run (extract_recent empty). Recomputed
conviction/expectation-gap/quality/master + user rankings; no tier-boundary
crossings, tiers carried forward (tierA 6). Regenerated all four ranking
docs, max-returns + expectation-gap rankings, mechanical lists. Rebuilt
Confluence 100 (180-ticker live scan, Overall 80/100 + Thesis 66/100
technicals resolved) and republished the artifact.

Co-Authored-By: Claude Sonnet 5 <noreply@anthropic.com>
</commit_message>
<xml_diff>
--- a/projects/valuepickr-open-screen/docs/00b_PORTFOLIO.docx
+++ b/projects/valuepickr-open-screen/docs/00b_PORTFOLIO.docx
@@ -32,7 +32,7 @@
           <w:sz w:val="20"/>
           <w:szCs w:val="20"/>
         </w:rPr>
-        <w:t xml:space="preserve">Compiled 2026-09-07 — built from the ongoing ValuePickr-wide open screen (separate from the original 108-stock project's docs/00b_PORTFOLIO_Rs1L_Allocation.docx)</w:t>
+        <w:t xml:space="preserve">Compiled 2026-09-09 — built from the ongoing ValuePickr-wide open screen (separate from the original 108-stock project's docs/00b_PORTFOLIO_Rs1L_Allocation.docx)</w:t>
       </w:r>
     </w:p>
     <w:p>
@@ -71,7 +71,7 @@
         <w:spacing w:after="120"/>
       </w:pPr>
       <w:r>
-        <w:t xml:space="preserve">Illustrative Rs 1,00,000 allocation drawn purely from this project's Tier-A bucket (conviction_score &gt;= 60, thesis_fit = 10x-in-2-3-years, no red flag) - the first run where Tier A reached the 5-name threshold. No market-cap ceiling; sizing follows conviction_score and thesis-return-magnitude rather than index weight, with a deliberate haircut on names whose valuation already prices in most of the near-term catalyst (Aeroflex's ~107x P/E, Wockhardt's expectation-gap 'over-optimistic/no-edge' flag). Two of the five (Venus Remedies, Wockhardt) sit in specialty pharma but on distinct sub-theses (cash-backed peer-valuation-gap turnaround vs a binary global-licensing catalyst on an already-approved NCE), so the book still spans four effectively independent business drivers. A 10% cash buffer is held back given how much of this batch has already re-rated.</w:t>
+        <w:t xml:space="preserve">Illustrative Rs 1,00,000 allocation drawn purely from this project's Tier-A bucket (conviction_score &gt;= 60, thesis_fit = 10x-in-2-3-years, no red flag). Tier A grew to six names on the 2026-09-09 rerank when Time Technoplast's conviction_score crossed 60 (Medium -&gt; Medium-High) on confirmed deleveraging plus ~5 straight quarters of ~20-25% PAT growth. No market-cap ceiling; sizing follows conviction_score and thesis-return-magnitude rather than index weight, with a deliberate haircut on names whose valuation already prices in most of the near-term catalyst (Aeroflex's ~107x P/E, Wockhardt's expectation-gap 'over-optimistic/no-edge' flag). The book spans specialty pharma (Venus, Wockhardt - distinct sub-theses), machine tools (Macpower), diagnostics (Thyrocare), AI-datacentre thermal (Aeroflex) and industrial packaging/deleveraging (Time Technoplast) - six effectively independent business drivers. A ~13% cash buffer is held back given how much of this batch has already re-rated.</w:t>
       </w:r>
     </w:p>
     <w:p>
@@ -239,7 +239,7 @@
                 <w:sz w:val="18"/>
                 <w:szCs w:val="18"/>
               </w:rPr>
-              <w:t xml:space="preserve">25%</w:t>
+              <w:t xml:space="preserve">23%</w:t>
             </w:r>
           </w:p>
         </w:tc>
@@ -253,7 +253,7 @@
                 <w:sz w:val="18"/>
                 <w:szCs w:val="18"/>
               </w:rPr>
-              <w:t xml:space="preserve">24850</w:t>
+              <w:t xml:space="preserve">23075</w:t>
             </w:r>
           </w:p>
         </w:tc>
@@ -281,7 +281,7 @@
                 <w:sz w:val="18"/>
                 <w:szCs w:val="18"/>
               </w:rPr>
-              <w:t xml:space="preserve">14</w:t>
+              <w:t xml:space="preserve">13</w:t>
             </w:r>
           </w:p>
         </w:tc>
@@ -325,7 +325,7 @@
                 <w:sz w:val="18"/>
                 <w:szCs w:val="18"/>
               </w:rPr>
-              <w:t xml:space="preserve">20%</w:t>
+              <w:t xml:space="preserve">17%</w:t>
             </w:r>
           </w:p>
         </w:tc>
@@ -339,7 +339,7 @@
                 <w:sz w:val="18"/>
                 <w:szCs w:val="18"/>
               </w:rPr>
-              <w:t xml:space="preserve">20070</w:t>
+              <w:t xml:space="preserve">16056</w:t>
             </w:r>
           </w:p>
         </w:tc>
@@ -367,7 +367,7 @@
                 <w:sz w:val="18"/>
                 <w:szCs w:val="18"/>
               </w:rPr>
-              <w:t xml:space="preserve">10</w:t>
+              <w:t xml:space="preserve">8</w:t>
             </w:r>
           </w:p>
         </w:tc>
@@ -411,7 +411,7 @@
                 <w:sz w:val="18"/>
                 <w:szCs w:val="18"/>
               </w:rPr>
-              <w:t xml:space="preserve">20%</w:t>
+              <w:t xml:space="preserve">16%</w:t>
             </w:r>
           </w:p>
         </w:tc>
@@ -425,7 +425,7 @@
                 <w:sz w:val="18"/>
                 <w:szCs w:val="18"/>
               </w:rPr>
-              <w:t xml:space="preserve">19840</w:t>
+              <w:t xml:space="preserve">16000</w:t>
             </w:r>
           </w:p>
         </w:tc>
@@ -453,7 +453,7 @@
                 <w:sz w:val="18"/>
                 <w:szCs w:val="18"/>
               </w:rPr>
-              <w:t xml:space="preserve">31</w:t>
+              <w:t xml:space="preserve">25</w:t>
             </w:r>
           </w:p>
         </w:tc>
@@ -497,7 +497,7 @@
                 <w:sz w:val="18"/>
                 <w:szCs w:val="18"/>
               </w:rPr>
-              <w:t xml:space="preserve">15%</w:t>
+              <w:t xml:space="preserve">12%</w:t>
             </w:r>
           </w:p>
         </w:tc>
@@ -511,7 +511,7 @@
                 <w:sz w:val="18"/>
                 <w:szCs w:val="18"/>
               </w:rPr>
-              <w:t xml:space="preserve">15176</w:t>
+              <w:t xml:space="preserve">11924</w:t>
             </w:r>
           </w:p>
         </w:tc>
@@ -539,7 +539,7 @@
                 <w:sz w:val="18"/>
                 <w:szCs w:val="18"/>
               </w:rPr>
-              <w:t xml:space="preserve">28</w:t>
+              <w:t xml:space="preserve">22</w:t>
             </w:r>
           </w:p>
         </w:tc>
@@ -569,6 +569,92 @@
                 <w:sz w:val="18"/>
                 <w:szCs w:val="18"/>
               </w:rPr>
+              <w:t xml:space="preserve">Time Technoplast</w:t>
+            </w:r>
+          </w:p>
+        </w:tc>
+        <w:tc>
+          <w:tcPr>
+            <w:tcW w:type="dxa" w:w="1400"/>
+          </w:tcPr>
+          <w:p>
+            <w:r>
+              <w:rPr>
+                <w:sz w:val="18"/>
+                <w:szCs w:val="18"/>
+              </w:rPr>
+              <w:t xml:space="preserve">12%</w:t>
+            </w:r>
+          </w:p>
+        </w:tc>
+        <w:tc>
+          <w:tcPr>
+            <w:tcW w:type="dxa" w:w="1400"/>
+          </w:tcPr>
+          <w:p>
+            <w:r>
+              <w:rPr>
+                <w:sz w:val="18"/>
+                <w:szCs w:val="18"/>
+              </w:rPr>
+              <w:t xml:space="preserve">11660</w:t>
+            </w:r>
+          </w:p>
+        </w:tc>
+        <w:tc>
+          <w:tcPr>
+            <w:tcW w:type="dxa" w:w="1200"/>
+          </w:tcPr>
+          <w:p>
+            <w:r>
+              <w:rPr>
+                <w:sz w:val="18"/>
+                <w:szCs w:val="18"/>
+              </w:rPr>
+              <w:t xml:space="preserve">530</w:t>
+            </w:r>
+          </w:p>
+        </w:tc>
+        <w:tc>
+          <w:tcPr>
+            <w:tcW w:type="dxa" w:w="1200"/>
+          </w:tcPr>
+          <w:p>
+            <w:r>
+              <w:rPr>
+                <w:sz w:val="18"/>
+                <w:szCs w:val="18"/>
+              </w:rPr>
+              <w:t xml:space="preserve">22</w:t>
+            </w:r>
+          </w:p>
+        </w:tc>
+        <w:tc>
+          <w:tcPr>
+            <w:tcW w:type="dxa" w:w="1200"/>
+          </w:tcPr>
+          <w:p>
+            <w:r>
+              <w:rPr>
+                <w:sz w:val="18"/>
+                <w:szCs w:val="18"/>
+              </w:rPr>
+              <w:t xml:space="preserve">Medium-High</w:t>
+            </w:r>
+          </w:p>
+        </w:tc>
+      </w:tr>
+      <w:tr>
+        <w:tc>
+          <w:tcPr>
+            <w:tcW w:type="dxa" w:w="2600"/>
+          </w:tcPr>
+          <w:p>
+            <w:r>
+              <w:rPr>
+                <w:sz w:val="18"/>
+                <w:szCs w:val="18"/>
+              </w:rPr>
               <w:t xml:space="preserve">Wockhardt Ltd</w:t>
             </w:r>
           </w:p>
@@ -583,7 +669,7 @@
                 <w:sz w:val="18"/>
                 <w:szCs w:val="18"/>
               </w:rPr>
-              <w:t xml:space="preserve">10%</w:t>
+              <w:t xml:space="preserve">8%</w:t>
             </w:r>
           </w:p>
         </w:tc>
@@ -597,7 +683,7 @@
                 <w:sz w:val="18"/>
                 <w:szCs w:val="18"/>
               </w:rPr>
-              <w:t xml:space="preserve">10435</w:t>
+              <w:t xml:space="preserve">8348</w:t>
             </w:r>
           </w:p>
         </w:tc>
@@ -625,7 +711,7 @@
                 <w:sz w:val="18"/>
                 <w:szCs w:val="18"/>
               </w:rPr>
-              <w:t xml:space="preserve">5</w:t>
+              <w:t xml:space="preserve">4</w:t>
             </w:r>
           </w:p>
         </w:tc>
@@ -662,7 +748,7 @@
           <w:sz w:val="20"/>
           <w:szCs w:val="20"/>
         </w:rPr>
-        <w:t xml:space="preserve">~90% deployed, ~10% (Rs 10,229) held as cash buffer. Sizing rule: conviction_score sets the base weight, then a valuation/expectation-gap haircut trims names where the catalyst looks largely priced in (Aeroflex's ~107x trailing P/E despite score 80; Wockhardt's expectation-gap score of 0 with an explicit 'over-optimistic/no-edge' flag caps it at the smallest position despite clearing the Tier-A bar on conviction_score alone). Thyrocare's price (~Rs 640) is an estimate anchored to its 52-week high of Rs 662 given accelerating PAT and a compressing multiple - not independently re-pulled this pass; verify live price before acting, as the doc disclaimer notes.</w:t>
+        <w:t xml:space="preserve">~87% deployed, ~13% (Rs 12,937) held as cash buffer. Sizing rule: conviction_score sets the base weight, then a valuation/expectation-gap haircut trims names where the catalyst looks largely priced in (Aeroflex's ~107x trailing P/E despite score 80; Wockhardt's expectation-gap score 0 with an explicit 'over-optimistic/no-edge' flag caps it at the smallest position despite clearing the Tier-A bar on conviction_score alone). Time Technoplast (new this cycle) enters at a mid-weight: score 62.8 is near the bottom of the tier, but its expectation-gap read is favourable ('underestimated', gap score ~52) and it is the cheapest name in the book at ~19x trailing for ~20% PAT growth plus deleveraging. Its price (~Rs 530) and Thyrocare's (~Rs 640) are estimates, not independently re-pulled this pass - verify live prices before acting, as the doc disclaimer notes.</w:t>
       </w:r>
     </w:p>
     <w:p>
@@ -702,7 +788,7 @@
           <w:sz w:val="20"/>
           <w:szCs w:val="20"/>
         </w:rPr>
-        <w:t xml:space="preserve">  —  25% allocation  |  Conviction: High</w:t>
+        <w:t xml:space="preserve">  —  23% allocation  |  Conviction: High</w:t>
       </w:r>
     </w:p>
     <w:p>
@@ -746,7 +832,7 @@
           <w:sz w:val="20"/>
           <w:szCs w:val="20"/>
         </w:rPr>
-        <w:t xml:space="preserve">Highest conviction_score in the batch (80.0) combined with the cheapest valuation of the five (~19x P/E, ~9x EV/EBITDA) and cash-backed (not accrual-led) earnings - the largest position.</w:t>
+        <w:t xml:space="preserve">Highest conviction_score in the batch (80.0) combined with the cheapest valuation of the six (~19x P/E, ~9x EV/EBITDA) and cash-backed (not accrual-led) earnings - the largest position.</w:t>
       </w:r>
     </w:p>
     <w:p>
@@ -792,7 +878,7 @@
           <w:sz w:val="20"/>
           <w:szCs w:val="20"/>
         </w:rPr>
-        <w:t xml:space="preserve">  —  20% allocation  |  Conviction: High</w:t>
+        <w:t xml:space="preserve">  —  17% allocation  |  Conviction: High</w:t>
       </w:r>
     </w:p>
     <w:p>
@@ -836,7 +922,7 @@
           <w:sz w:val="20"/>
           <w:szCs w:val="20"/>
         </w:rPr>
-        <w:t xml:space="preserve">Strong conviction_score (66.0) and a real, multi-quarter confirmed inflection - sized just behind Venus, ahead of the two lower-scoring, higher-valuation names.</w:t>
+        <w:t xml:space="preserve">Strong conviction_score (66.0) and a real, multi-quarter confirmed inflection - sized just behind Venus, ahead of the lower-scoring, higher-valuation names.</w:t>
       </w:r>
     </w:p>
     <w:p>
@@ -882,7 +968,7 @@
           <w:sz w:val="20"/>
           <w:szCs w:val="20"/>
         </w:rPr>
-        <w:t xml:space="preserve">  —  20% allocation  |  Conviction: High</w:t>
+        <w:t xml:space="preserve">  —  16% allocation  |  Conviction: High</w:t>
       </w:r>
     </w:p>
     <w:p>
@@ -972,7 +1058,7 @@
           <w:sz w:val="20"/>
           <w:szCs w:val="20"/>
         </w:rPr>
-        <w:t xml:space="preserve">  —  15% allocation  |  Conviction: High</w:t>
+        <w:t xml:space="preserve">  —  12% allocation  |  Conviction: High</w:t>
       </w:r>
     </w:p>
     <w:p>
@@ -1052,6 +1138,96 @@
           <w:sz w:val="26"/>
           <w:szCs w:val="26"/>
         </w:rPr>
+        <w:t xml:space="preserve">Time Technoplast</w:t>
+      </w:r>
+      <w:r>
+        <w:rPr>
+          <w:b/>
+          <w:bCs/>
+          <w:color w:val="3D7A1E"/>
+          <w:sz w:val="20"/>
+          <w:szCs w:val="20"/>
+        </w:rPr>
+        <w:t xml:space="preserve">  —  12% allocation  |  Conviction: Medium-High</w:t>
+      </w:r>
+    </w:p>
+    <w:p>
+      <w:pPr>
+        <w:spacing w:after="100"/>
+      </w:pPr>
+      <w:r>
+        <w:rPr>
+          <w:i/>
+          <w:iCs/>
+          <w:color w:val="666666"/>
+          <w:sz w:val="20"/>
+          <w:szCs w:val="20"/>
+        </w:rPr>
+        <w:t xml:space="preserve">Industrial-packaging compounder finishing a multi-year deleveraging, ~20-25% PAT growth for five straight quarters, still cheap</w:t>
+      </w:r>
+    </w:p>
+    <w:p>
+      <w:pPr>
+        <w:spacing w:after="120"/>
+      </w:pPr>
+      <w:r>
+        <w:t xml:space="preserve">Q1 FY27 revenue +25% / PAT +22%, the ~fifth consecutive quarter of ~20-25% PAT growth, with the composite (value-added) mix rising 27% -&gt; 35% and ROCE guided from 18.9% FY26 toward 23%+ FY28. FY26 cut net debt by Rs 409 Cr with net-debt-free targeted in 12-18 months - the falling interest drag is a structural, steel-price-independent earnings tailwind on top of volume growth. Trades ~19x trailing, undemanding for the growth-plus-deleveraging combination; expectation-gap module reads 'underestimated' (gap score ~52).</w:t>
+      </w:r>
+    </w:p>
+    <w:p>
+      <w:pPr>
+        <w:spacing w:after="100"/>
+      </w:pPr>
+      <w:r>
+        <w:rPr>
+          <w:b/>
+          <w:bCs/>
+          <w:sz w:val="20"/>
+          <w:szCs w:val="20"/>
+        </w:rPr>
+        <w:t xml:space="preserve">Why this weight: </w:t>
+      </w:r>
+      <w:r>
+        <w:rPr>
+          <w:sz w:val="20"/>
+          <w:szCs w:val="20"/>
+        </w:rPr>
+        <w:t xml:space="preserve">conviction_score 62.8 (Medium-High) is near the bottom of the tier, so a mid-weight; but it is the cheapest name in the book and the only one with a clearly favourable expectation-gap read, which offsets the lower conviction score - sized level with Aeroflex.</w:t>
+      </w:r>
+    </w:p>
+    <w:p>
+      <w:pPr>
+        <w:spacing w:after="160"/>
+      </w:pPr>
+      <w:r>
+        <w:rPr>
+          <w:b/>
+          <w:bCs/>
+          <w:color w:val="A32020"/>
+          <w:sz w:val="20"/>
+          <w:szCs w:val="20"/>
+        </w:rPr>
+        <w:t xml:space="preserve">Watch for (thesis-breakers): </w:t>
+      </w:r>
+      <w:r>
+        <w:rPr>
+          <w:sz w:val="20"/>
+          <w:szCs w:val="20"/>
+        </w:rPr>
+        <w:t xml:space="preserve">The VAP-mix shift and the net-debt-free milestone are the thesis - a stall in either (composite mix flat, or working capital reabsorbing the deleveraging) breaks it. Guidance credibility is 'mixed' historically. Confirm the ~Rs 530 entry price live before acting.</w:t>
+      </w:r>
+    </w:p>
+    <w:p>
+      <w:pPr>
+        <w:spacing w:after="40" w:before="240"/>
+      </w:pPr>
+      <w:r>
+        <w:rPr>
+          <w:b/>
+          <w:bCs/>
+          <w:sz w:val="26"/>
+          <w:szCs w:val="26"/>
+        </w:rPr>
         <w:t xml:space="preserve">Wockhardt Ltd</w:t>
       </w:r>
       <w:r>
@@ -1062,7 +1238,7 @@
           <w:sz w:val="20"/>
           <w:szCs w:val="20"/>
         </w:rPr>
-        <w:t xml:space="preserve">  —  10% allocation  |  Conviction: Medium</w:t>
+        <w:t xml:space="preserve">  —  8% allocation  |  Conviction: Medium</w:t>
       </w:r>
     </w:p>
     <w:p>
@@ -1157,7 +1333,7 @@
         <w:spacing w:after="80"/>
       </w:pPr>
       <w:r>
-        <w:t xml:space="preserve">2026-09-07 cycle: Tier-A membership and conviction_scores re-confirmed unchanged (Venus 80, Aeroflex 72, Macpower/Thyrocare 60, Wockhardt 61.3) - no rebalance; allocation, prices and sizing carried forward from 2026-09-05. Verify live prices before acting.</w:t>
+        <w:t xml:space="preserve">2026-09-09 cycle: Tier A grew from 5 to 6 names - Time Technoplast crossed conviction_score 60 (62.8, Medium-High). Rebalanced: existing five trimmed proportionally to fund a 12% Time Technoplast position; cash buffer widened slightly to ~13%. Other scores re-confirmed (Venus 80, Aeroflex 80, Macpower 66, Wockhardt 61.3, Thyrocare 60). Verify live prices before acting.</w:t>
       </w:r>
     </w:p>
     <w:p>
@@ -1170,7 +1346,7 @@
         <w:spacing w:after="80"/>
       </w:pPr>
       <w:r>
-        <w:t xml:space="preserve">This is the first Tier-A batch to reach the 5-name portfolio threshold (moved from 4 to 5 this run when Wockhardt's conviction_score crossed 60) - treat sizing as provisional until at least one more ranking cycle confirms the tier is stable, not a momentary crossing.</w:t>
+        <w:t xml:space="preserve">Time Technoplast is a one-cycle tier entrant - treat its sizing as provisional until a second ranking cycle confirms it holds above 60, not a momentary crossing.</w:t>
       </w:r>
     </w:p>
     <w:p>
@@ -1196,7 +1372,7 @@
         <w:spacing w:after="80"/>
       </w:pPr>
       <w:r>
-        <w:t xml:space="preserve">Three of five names (Macpower, Aeroflex, Wockhardt) are trading at stretched multiples (~52x, ~107x, ~85x respectively) relative to their own history - a broad market drawdown would likely hit this book's re-rated names hardest first.</w:t>
+        <w:t xml:space="preserve">Three of six names (Macpower, Aeroflex, Wockhardt) are trading at stretched multiples (~52x, ~107x, ~85x respectively) relative to their own history - a broad market drawdown would likely hit this book's re-rated names hardest first. Time Technoplast (~19x) and Venus (~19x) are the valuation ballast.</w:t>
       </w:r>
     </w:p>
     <w:p>
@@ -1209,7 +1385,7 @@
         <w:spacing w:after="80"/>
       </w:pPr>
       <w:r>
-        <w:t xml:space="preserve">Thyrocare has not yet had the deep-dive guidance/expectation-gap pass (commitments, earnings_chain, market_expectation blocks) that the other four have - re-check its sizing once deepdive-top100 covers it.</w:t>
+        <w:t xml:space="preserve">Thyrocare has not yet had the deep-dive guidance/expectation-gap pass (commitments, earnings_chain, market_expectation blocks) that the other names have - re-check its sizing once deepdive-top100 covers it.</w:t>
       </w:r>
     </w:p>
     <w:p>
@@ -1222,7 +1398,7 @@
         <w:spacing w:after="80"/>
       </w:pPr>
       <w:r>
-        <w:t xml:space="preserve">Cash buffer (10%) is intentionally held given how much of this batch has already re-rated; redeploy only into a fresh Tier-A entry or an existing position pulling back to a materially cheaper multiple, not into adding to current winners at current prices.</w:t>
+        <w:t xml:space="preserve">Cash buffer (~13%) is intentionally held given how much of this batch has already re-rated; redeploy only into a fresh Tier-A entry or an existing position pulling back to a materially cheaper multiple, not into adding to current winners at current prices.</w:t>
       </w:r>
     </w:p>
     <w:p>

</xml_diff>